<commit_message>
25410262 Nguyen Duc Nghia - Tuan 3 - Quy trinh Mua hang & Chuoi cung ung (gop MM.03+04+05), sua loi BPMN CL2, don cau truc thu muc
</commit_message>
<xml_diff>
--- a/IE203-Nhom7/25410262_NguyenDucNghia/Quy_trinh_Don_hang_Online/Phan_tich_Don_hang_Online.docx
+++ b/IE203-Nhom7/25410262_NguyenDucNghia/Quy_trinh_Don_hang_Online/Phan_tich_Don_hang_Online.docx
@@ -2797,9 +2797,17 @@
     </w:p>
     <w:p>
       <w:r>
+        <w:rPr>
+          <w:i/>
+        </w:rPr>
+        <w:t>Hình 1 — Sơ đồ luồng BPMN AS-IS quy trình CL2 (6 lane, 8 cổng điều kiện, có Split/Join, kèm biểu mẫu)</w:t>
+      </w:r>
+    </w:p>
+    <w:p>
+      <w:r>
         <w:drawing>
           <wp:inline xmlns:a="http://schemas.openxmlformats.org/drawingml/2006/main" xmlns:pic="http://schemas.openxmlformats.org/drawingml/2006/picture">
-            <wp:extent cx="5760720" cy="1963717"/>
+            <wp:extent cx="5760720" cy="2550079"/>
             <wp:docPr id="1" name="Picture 1"/>
             <wp:cNvGraphicFramePr>
               <a:graphicFrameLocks noChangeAspect="1"/>
@@ -2808,11 +2816,11 @@
               <a:graphicData uri="http://schemas.openxmlformats.org/drawingml/2006/picture">
                 <pic:pic>
                   <pic:nvPicPr>
-                    <pic:cNvPr id="0" name="BPMN_CL2_DonHangOnline_GiaoHangTuoi.png"/>
+                    <pic:cNvPr id="0" name="BPMN_Don_hang_Online.png"/>
                     <pic:cNvPicPr/>
                   </pic:nvPicPr>
                   <pic:blipFill>
-                    <a:blip r:embed="rId8"/>
+                    <a:blip r:embed="rId10"/>
                     <a:stretch>
                       <a:fillRect/>
                     </a:stretch>
@@ -2820,7 +2828,7 @@
                   <pic:spPr>
                     <a:xfrm>
                       <a:off x="0" y="0"/>
-                      <a:ext cx="5760720" cy="1963717"/>
+                      <a:ext cx="5760720" cy="2550079"/>
                     </a:xfrm>
                     <a:prstGeom prst="rect"/>
                   </pic:spPr>
@@ -2829,14 +2837,6 @@
             </a:graphic>
           </wp:inline>
         </w:drawing>
-      </w:r>
-    </w:p>
-    <w:p>
-      <w:r>
-        <w:rPr>
-          <w:i/>
-        </w:rPr>
-        <w:t>Hình 1 — Sơ đồ luồng BPMN AS-IS quy trình CL2 (6 lane)</w:t>
       </w:r>
     </w:p>
     <w:p>

</xml_diff>